<commit_message>
Drie verouderde nummerverwijzingen in de documenten gecorrigeerd
</commit_message>
<xml_diff>
--- a/bestanden/10_Brainstorm.docx
+++ b/bestanden/10_Brainstorm.docx
@@ -268,7 +268,7 @@
                 <w:szCs w:val="18"/>
                 <w:lang w:val="nl-NL"/>
               </w:rPr>
-              <w:t xml:space="preserve">Een gevulde ideeënlijst en een gekozen richting, die je prioriteert met 10.</w:t>
+              <w:t>Een gevulde ideeënlijst en een gekozen richting, die je prioriteert met 11.</w:t>
             </w:r>
           </w:p>
         </w:tc>
@@ -2702,7 +2702,7 @@
               <w:rPr>
                 <w:lang w:val="nl-NL"/>
               </w:rPr>
-              <w:t xml:space="preserve"> starten met materiaal dat docenten kunnen overnemen, de rest prioriteren met 10 Prioriteren.</w:t>
+              <w:t xml:space="preserve"> starten met materiaal dat docenten kunnen overnemen, de rest prioriteren met 11 Prioriteren.</w:t>
             </w:r>
           </w:p>
         </w:tc>

</xml_diff>